<commit_message>
README: incisor AT-5482 BAM (was misnamed FemurXIII); real coverage ~0.02x
</commit_message>
<xml_diff>
--- a/results/PopSize_ShortComm_JHE_v6_GarciaMoran.docx
+++ b/results/PopSize_ShortComm_JHE_v6_GarciaMoran.docx
@@ -202,7 +202,7 @@
           <w:sz w:val="24"/>
           <w:szCs w:val="24"/>
         </w:rPr>
-        <w:t xml:space="preserve">The Neandertal lineage exhibits chronically low effective population sizes (Ne ~3,000) during the Late Pleistocene, but when this demographic erosion began remains unresolved. We estimated transversion-restricted heterozygosity (H) and pairwise FST across four Middle Pleistocene hominin genomes (~430 ka) from Sima de los Huesos (SH, Atapuerca, Spain), using a symmetric pipeline cross-calibrated against Vindija 33.19 and independently validated against the Denisova high-coverage genome. Block-bootstrap resampling (n = 100, 5 Mb blocks) suggests higher ancestral genetic diversity (mean calibrated H = 0.000977; heterozygosity-derived Ne ~19,571) than late Neandertals (ratio 1.39x). Two independent estimators converge on significant internal stratification: molar_L35 and femurXIII form a genetically cohesive cluster (FST = 0.041, high H), while scapula shows significantly lower H with non-overlapping confidence intervals. femur_fragment is a genetic outlier (FST ~0.30). This internal structure is consistent with a diachronic accumulation model spanning climatically distinct Marine Isotope Stages. (149 words)</w:t>
+        <w:t xml:space="preserve">The Neandertal lineage exhibits chronically low effective population sizes (Ne ~3,000) during the Late Pleistocene, but when this demographic erosion began remains unresolved. We estimated transversion-restricted heterozygosity (H) and pairwise FST across four Middle Pleistocene hominin genomes (~430 ka) from Sima de los Huesos (SH, Atapuerca, Spain), using a symmetric pipeline cross-calibrated against Vindija 33.19 and independently validated against the Denisova high-coverage genome. Block-bootstrap resampling (n = 100, 5 Mb blocks) suggests higher ancestral genetic diversity (mean calibrated H = 0.000977; Ne ~19,571 (heterozygosity-derived)) than late Neandertals (ratio 1.39x). Two independent estimators converge on significant internal stratification: molar_L35 and femurXIII form a genetically cohesive cluster (FST = 0.041, high H), while scapula shows significantly lower H with non-overlapping confidence intervals. femur_fragment is a genetic outlier (FST ~0.30). This internal structure is consistent with a diachronic accumulation model spanning climatically distinct Marine Isotope Stages. (149 words)</w:t>
       </w:r>
     </w:p>
     <w:p>
@@ -2628,7 +2628,7 @@
                 <w:sz w:val="20"/>
                 <w:szCs w:val="20"/>
               </w:rPr>
-              <w:t xml:space="preserve">1.51×10⁻⁴</w:t>
+              <w:t xml:space="preserve">0.000151</w:t>
             </w:r>
           </w:p>
         </w:tc>
@@ -4442,7 +4442,7 @@
           <w:sz w:val="24"/>
           <w:szCs w:val="24"/>
         </w:rPr>
-        <w:t xml:space="preserve">The convergence of two independent estimators on the same internal structure strengthens the biological interpretation. Calibrated heterozygosity and pairwise FST both separate the specimens into the same groups: a genetically cohesive cluster of molar_L35 and femurXIII (high H, low mutual FST = 0.041), a genetically distinct scapula (low H, intermediate FST), and an outlier femur_fragment (intermediate H, high FST = 0.284–0.302). This convergence is unlikely to result from a single technical artifact, since heterozygosity measures within-individual diversity whereas FST measures between-individual divergence. Notably, the internal genetic heterogeneity among four SH specimens from a single site (FST range 0.0420130.30) exceeds that observed among 10 late Neandertals from multiple sites across northwestern Europe (IBS distance range 0.0420130.16; Bossoms Mesa et al., 2026; Figure 3), consistent with temporally heterogeneous sampling at SH.</w:t>
+        <w:t xml:space="preserve">The convergence of two independent estimators on the same internal structure strengthens the biological interpretation. Calibrated heterozygosity and pairwise FST both separate the specimens into the same groups: a genetically cohesive cluster of molar_L35 and femurXIII (high H, low mutual FST = 0.041), a genetically distinct scapula (low H, intermediate FST), and an outlier femur_fragment (intermediate H, high FST = 0.284–0.302). This convergence is unlikely to result from a single technical artifact, since heterozygosity measures within-individual diversity whereas FST measures between-individual divergence. Notably, the internal genetic heterogeneity among four SH specimens from a single site (FST range 0.0420130.30) exceeds that observed among 10 late Neandertals from multiple sites across northwestern Europe (IBS distance range 0.0420130.16; Bossoms Mesa et al., 2026; Figure 3), consistent with temporally heterogeneous sampling at SH. We note that FST and IBS are not directly comparable metrics; however, the contrast in range of internal variation is informative regardless of the absolute scale.</w:t>
       </w:r>
     </w:p>
     <w:p>

</xml_diff>